<commit_message>
docs: record continuous Ethernet FFT handoff
</commit_message>
<xml_diff>
--- a/PROJECT/reports/profen_staj_raporu.docx
+++ b/PROJECT/reports/profen_staj_raporu.docx
@@ -15128,6 +15128,171 @@
     <w:p>
       <w:r>
         <w:br w:type="page"/>
+      </w:r>
+    </w:p>
+    <w:p>
+      <w:pPr>
+        <w:pStyle w:val="Heading1"/>
+      </w:pPr>
+      <w:r>
+        <w:t>26. Sürekli Bare-Metal UDP FFT Aktarımı — 31 Temmuz 2026</w:t>
+      </w:r>
+    </w:p>
+    <w:p>
+      <w:r>
+        <w:t>Bu ek geliştirme, kart üzerinde doğrulanmış 2048-bin PL FFT sonucunu PetaLinux eklemeden, AXU4EVB-P PS GEM3 arabirimi ve lwIP RAW UDP üzerinden Windows bilgisayara sürekli taşımak için hazırlanmıştır. Çalışan Golden, vitis2 ve önceki Candidate paketleri değiştirilmemiştir.</w:t>
+      </w:r>
+    </w:p>
+    <w:p>
+      <w:pPr>
+        <w:pStyle w:val="Heading2"/>
+      </w:pPr>
+      <w:r>
+        <w:t>26.1 Mimari ve veri sözleşmesi</w:t>
+      </w:r>
+    </w:p>
+    <w:p>
+      <w:pPr>
+        <w:pStyle w:val="ListBullet"/>
+      </w:pPr>
+      <w:r>
+        <w:t>Kart: 192.168.1.10/24; bilgisayar: 192.168.1.100/24; UDP hedef portu: 5005.</w:t>
+      </w:r>
+    </w:p>
+    <w:p>
+      <w:pPr>
+        <w:pStyle w:val="ListBullet"/>
+      </w:pPr>
+      <w:r>
+        <w:t>Her FFT karesi 2048 adet unsigned 64-bit spektrum bininden oluşur.</w:t>
+      </w:r>
+    </w:p>
+    <w:p>
+      <w:pPr>
+        <w:pStyle w:val="ListBullet"/>
+      </w:pPr>
+      <w:r>
+        <w:t>64 baytlık sürümlü başlık network byte order, spektrum payload'u little-endian kullanır.</w:t>
+      </w:r>
+    </w:p>
+    <w:p>
+      <w:pPr>
+        <w:pStyle w:val="ListBullet"/>
+      </w:pPr>
+      <w:r>
+        <w:t>Bir kare, Ethernet MTU sınırını aşmayan 12 UDP datagramına bölünür: ilk 11 parça 176, son parça 112 bin taşır.</w:t>
+      </w:r>
+    </w:p>
+    <w:p>
+      <w:pPr>
+        <w:pStyle w:val="ListBullet"/>
+      </w:pPr>
+      <w:r>
+        <w:t>Varsayılan yayın saniyede 4 kare ve süresizdir; --frames N yalnız kontrollü kayıt ve kabul testi içindir.</w:t>
+      </w:r>
+    </w:p>
+    <w:p>
+      <w:pPr>
+        <w:pStyle w:val="Heading2"/>
+      </w:pPr>
+      <w:r>
+        <w:t>26.2 Tamamlanan uygulama</w:t>
+      </w:r>
+    </w:p>
+    <w:p>
+      <w:pPr>
+        <w:pStyle w:val="ListBullet"/>
+      </w:pPr>
+      <w:r>
+        <w:t>Transport bağımsız sürekli FFT servisi ve parçalama/protokol katmanı.</w:t>
+      </w:r>
+    </w:p>
+    <w:p>
+      <w:pPr>
+        <w:pStyle w:val="ListBullet"/>
+      </w:pPr>
+      <w:r>
+        <w:t>ZynqMP GEM3 ile lwIP211 RAW/statik IPv4 taşıyıcısı.</w:t>
+      </w:r>
+    </w:p>
+    <w:p>
+      <w:pPr>
+        <w:pStyle w:val="ListBullet"/>
+      </w:pPr>
+      <w:r>
+        <w:t>Mevcut Vitis projelerinden ayrılmış vitis_ethernet çalışma alanı ve Release ELF üretimi.</w:t>
+      </w:r>
+    </w:p>
+    <w:p>
+      <w:pPr>
+        <w:pStyle w:val="ListBullet"/>
+      </w:pPr>
+      <w:r>
+        <w:t>Python datagram decoder, frame reassembly, canlı Matplotlib FFT görüntüleyici ve kayıt seçenekleri.</w:t>
+      </w:r>
+    </w:p>
+    <w:p>
+      <w:pPr>
+        <w:pStyle w:val="ListBullet"/>
+      </w:pPr>
+      <w:r>
+        <w:t>Sıra, parça kapsamı, CRC, frame bütünlüğü ve zaman sınırı denetimli headless kabul/soak araçları.</w:t>
+      </w:r>
+    </w:p>
+    <w:p>
+      <w:pPr>
+        <w:pStyle w:val="Heading2"/>
+      </w:pPr>
+      <w:r>
+        <w:t>26.3 Doğrulama sonucu ve dürüst sınır</w:t>
+      </w:r>
+    </w:p>
+    <w:p>
+      <w:r>
+        <w:t>Host regresyonundaki 38 test geçmiştir. Vitis 2020.1 ile temiz ayrı çalışma alanında gerçek Release build'i tamamlanmış ve vitis_ethernet/workspace/ad9364app/Release/ad9364app.elf üretilmiştir. Buna karşılık bilgisayarda Ethernet portu ve USB-Ethernet adaptörü bulunmadığı için kart ping'i, gerçek UDP frame yakalama, 150-frame kabul, 600 saniyelik soak ve kablosuz CW ölçümü henüz yapılmamıştır. Dolayısıyla bu bölüm fiziksel Ethernet/RF PASS veya board_verified=true iddiası içermez; monopulse-live-ethernet-v1 Candidate henüz yayımlanmamıştır.</w:t>
+      </w:r>
+    </w:p>
+    <w:p>
+      <w:pPr>
+        <w:pStyle w:val="Heading2"/>
+      </w:pPr>
+      <w:r>
+        <w:t>26.4 Adaptör geldikten sonraki devir adımları</w:t>
+      </w:r>
+    </w:p>
+    <w:p>
+      <w:r>
+        <w:t>1. Kartı JTAG, PS_UART ve Ethernet üzerinden bağla; PuTTY kaydını aç.</w:t>
+      </w:r>
+    </w:p>
+    <w:p>
+      <w:r>
+        <w:t>2. USB-Ethernet adaptörünü 192.168.1.100/24 yap; gateway ve DNS alanlarını boş bırak.</w:t>
+      </w:r>
+    </w:p>
+    <w:p>
+      <w:r>
+        <w:t>3. PROJECT/tools/Start-Axu4evAd9364EthernetDev.cmd ile Ethernet ELF'ini başlat.</w:t>
+      </w:r>
+    </w:p>
+    <w:p>
+      <w:r>
+        <w:t>4. UART'ta PL_FFT_ETH: READY satırını gör ve ping 192.168.1.10 kapısını geç.</w:t>
+      </w:r>
+    </w:p>
+    <w:p>
+      <w:r>
+        <w:t>5. Önce 150 ardışık frame headless kabulünü, sonra en az 600 saniye soak testini çalıştır.</w:t>
+      </w:r>
+    </w:p>
+    <w:p>
+      <w:r>
+        <w:t>6. Ağ yolu kararlıysa SMW200A ile düşük seviyeden başlayan, mesafeli ve sınırlı kablosuz CW kabulünü uygula.</w:t>
+      </w:r>
+    </w:p>
+    <w:p>
+      <w:r>
+        <w:t>7. Tüm kanıtlar PASS olduktan sonra monopulse-live-ethernet-v1 Candidate paketini oluştur ve hash/log/manifest ile arşivle.</w:t>
       </w:r>
     </w:p>
     <w:p>

</xml_diff>

<commit_message>
docs: prepare final internship handoff
</commit_message>
<xml_diff>
--- a/PROJECT/reports/profen_staj_raporu.docx
+++ b/PROJECT/reports/profen_staj_raporu.docx
@@ -1566,6 +1566,22 @@
     <w:p>
       <w:pPr>
         <w:pStyle w:val="TOCEntry"/>
+      </w:pPr>
+      <w:r>
+        <w:t>26. Sürekli Bare-Metal UDP FFT Aktarımı</w:t>
+      </w:r>
+    </w:p>
+    <w:p>
+      <w:pPr>
+        <w:pStyle w:val="TOCEntry"/>
+      </w:pPr>
+      <w:r>
+        <w:t>27. Proje Teslim Kapanışı</w:t>
+      </w:r>
+    </w:p>
+    <w:p>
+      <w:pPr>
+        <w:pStyle w:val="TOCEntry"/>
         <w:pBdr>
           <w:bottom w:val="single" w:sz="3" w:space="2" w:color="F4F6F9"/>
         </w:pBdr>
@@ -15293,6 +15309,80 @@
     <w:p>
       <w:r>
         <w:t>7. Tüm kanıtlar PASS olduktan sonra monopulse-live-ethernet-v1 Candidate paketini oluştur ve hash/log/manifest ile arşivle.</w:t>
+      </w:r>
+    </w:p>
+    <w:p>
+      <w:pPr>
+        <w:pStyle w:val="Heading1"/>
+      </w:pPr>
+      <w:r>
+        <w:t>27. Proje Teslim Kapanışı — 3 Ağustos 2026</w:t>
+      </w:r>
+    </w:p>
+    <w:p>
+      <w:r>
+        <w:t>Staj kapanışında kaynak kodu, doğrulanmış Golden/Candidate paketleri, otomatik testler, sunum ve teknik raporlar tek bir teslim düzeninde toplanmıştır. Kök README proje haritasını; PROJECT/reports/TESLIM_NOTLARI_2026-08-03.md ise devralacak kişinin ilk gün sırasını, değişmez artefaktları ve açık kabul kapılarını tanımlar.</w:t>
+      </w:r>
+    </w:p>
+    <w:p>
+      <w:pPr>
+        <w:pStyle w:val="Heading2"/>
+      </w:pPr>
+      <w:r>
+        <w:t>27.1 Son yazılım doğrulaması</w:t>
+      </w:r>
+    </w:p>
+    <w:p>
+      <w:pPr>
+        <w:pStyle w:val="ListBullet"/>
+      </w:pPr>
+      <w:r>
+        <w:t>Ethernet decoder/reassembly/viewer regresyonu: 38 test PASS.</w:t>
+      </w:r>
+    </w:p>
+    <w:p>
+      <w:pPr>
+        <w:pStyle w:val="ListBullet"/>
+      </w:pPr>
+      <w:r>
+        <w:t>Monopulse, FFT C-model ve UART model regresyonu: 61 test PASS.</w:t>
+      </w:r>
+    </w:p>
+    <w:p>
+      <w:pPr>
+        <w:pStyle w:val="ListBullet"/>
+      </w:pPr>
+      <w:r>
+        <w:t>Bare-metal FFT lab-console regresyonu: 39 test PASS.</w:t>
+      </w:r>
+    </w:p>
+    <w:p>
+      <w:pPr>
+        <w:pStyle w:val="ListBullet"/>
+      </w:pPr>
+      <w:r>
+        <w:t>Golden release, live-lab Candidate ve periyodik monitor paket bütünlüğü: PASS.</w:t>
+      </w:r>
+    </w:p>
+    <w:p>
+      <w:pPr>
+        <w:pStyle w:val="ListBullet"/>
+      </w:pPr>
+      <w:r>
+        <w:t>Teslim RAR'ı temiz Git snapshotı, tam Git bundle ve SHA-256 manifestiyle üretilir.</w:t>
+      </w:r>
+    </w:p>
+    <w:p>
+      <w:pPr>
+        <w:pStyle w:val="Heading2"/>
+      </w:pPr>
+      <w:r>
+        <w:t>27.2 Teslimde açık bırakılan işler</w:t>
+      </w:r>
+    </w:p>
+    <w:p>
+      <w:r>
+        <w:t>USB-Ethernet adaptörü bulunmadığından fiziksel UDP kabulü ve kablosuz CW Ethernet testi tamamlanmamıştır. ZX80-DR230-S+ ile EV1HMC936ALP6 S0-S3 kontrol entegrasyonu da gelecekteki çalışmadır. Eski Workspace launcher, farklı tarihlerden kalan Vivado/Vitis kopyalarının birebir hash eşitliğini aradığı için teslim yolu değildir; günlük kullanımda immutable Golden ve Candidate launcher'ları esas alınır. Bu sınırlar ürün kabulü yapılmış gibi yorumlanmamalıdır.</w:t>
       </w:r>
     </w:p>
     <w:p>

</xml_diff>